<commit_message>
docs: update submission dossier and evaluation matrix to 9 benchmark tests
</commit_message>
<xml_diff>
--- a/submission/Darukaa_Earth_Submission_Dossier.docx
+++ b/submission/Darukaa_Earth_Submission_Dossier.docx
@@ -308,6 +308,38 @@
           </w:tcPr>
           <w:p>
             <w:r>
+              <w:t>Human Impact &amp; Pollution</w:t>
+            </w:r>
+          </w:p>
+        </w:tc>
+        <w:tc>
+          <w:tcPr>
+            <w:tcW w:type="dxa" w:w="2880"/>
+          </w:tcPr>
+          <w:p>
+            <w:r>
+              <w:t>Riparian bio-filtration and biochar sorption modeling for chemical runoff</w:t>
+            </w:r>
+          </w:p>
+        </w:tc>
+        <w:tc>
+          <w:tcPr>
+            <w:tcW w:type="dxa" w:w="2880"/>
+          </w:tcPr>
+          <w:p>
+            <w:r>
+              <w:t>UNEP/FAO Global Assessment of Soil Pollution (2021)</w:t>
+            </w:r>
+          </w:p>
+        </w:tc>
+      </w:tr>
+      <w:tr>
+        <w:tc>
+          <w:tcPr>
+            <w:tcW w:type="dxa" w:w="2880"/>
+          </w:tcPr>
+          <w:p>
+            <w:r>
               <w:t>Geo-Spatial Bonus</w:t>
             </w:r>
           </w:p>
@@ -387,12 +419,12 @@
         <w:br/>
         <w:t># 4. Launch Streamlit Environmental Scientist Dashboard</w:t>
         <w:br/>
-        <w:t>streamlit run app.py</w:t>
+        <w:t>python -m streamlit run app.py</w:t>
         <w:br/>
         <w:br/>
         <w:t># 5. (Optional) Run FastAPI REST Service</w:t>
         <w:br/>
-        <w:t>uvicorn api.main:app --port 8000 --reload</w:t>
+        <w:t>python -m uvicorn api.main:app --port 8000 --reload</w:t>
       </w:r>
     </w:p>
     <w:p>

</xml_diff>

<commit_message>
docs: feature live Streamlit deployed URL in README and submission dossier
</commit_message>
<xml_diff>
--- a/submission/Darukaa_Earth_Submission_Dossier.docx
+++ b/submission/Darukaa_Earth_Submission_Dossier.docx
@@ -47,17 +47,27 @@
         <w:rPr>
           <w:b/>
         </w:rPr>
-        <w:t xml:space="preserve">• Live Demo URL: </w:t>
+        <w:t xml:space="preserve">• Live Deployed Web Application: </w:t>
       </w:r>
       <w:r>
-        <w:t>https://darukaa-biodiversity-ai.streamlit.app (or local workbench at http://localhost:8501)</w:t>
+        <w:t>https://darukaa-biodiversity-ai-ppf4tx9gdwrupkyfm2itcy.streamlit.app/</w:t>
         <w:br/>
       </w:r>
       <w:r>
         <w:rPr>
           <w:b/>
         </w:rPr>
-        <w:t xml:space="preserve">• API Documentation URL: </w:t>
+        <w:t xml:space="preserve">• Local Workbench URL: </w:t>
+      </w:r>
+      <w:r>
+        <w:t>http://localhost:8501 (via python -m streamlit run app.py)</w:t>
+        <w:br/>
+      </w:r>
+      <w:r>
+        <w:rPr>
+          <w:b/>
+        </w:rPr>
+        <w:t xml:space="preserve">• REST API Documentation URL: </w:t>
       </w:r>
       <w:r>
         <w:t>http://localhost:8000/docs (Interactive Swagger/OpenAPI)</w:t>

</xml_diff>

<commit_message>
docs: make all URLs clickable hyperlinks in submission dossier and fix README links
</commit_message>
<xml_diff>
--- a/submission/Darukaa_Earth_Submission_Dossier.docx
+++ b/submission/Darukaa_Earth_Submission_Dossier.docx
@@ -33,44 +33,89 @@
       </w:r>
     </w:p>
     <w:p>
+      <w:pPr>
+        <w:pStyle w:val="ListBullet"/>
+      </w:pPr>
       <w:r>
         <w:rPr>
           <w:b/>
         </w:rPr>
-        <w:t xml:space="preserve">• GitHub Repository: </w:t>
+        <w:t xml:space="preserve">GitHub Repository: </w:t>
       </w:r>
-      <w:r>
-        <w:t>https://github.com/itsayushkr-dotcom/darukaa-biodiversity-ai</w:t>
-        <w:br/>
-      </w:r>
+      <w:hyperlink r:id="rId9">
+        <w:r>
+          <w:rPr>
+            <w:color w:val="0066CC"/>
+            <w:u w:val="single"/>
+          </w:rPr>
+          <w:t>https://github.com/itsayushkr-dotcom/darukaa-biodiversity-ai</w:t>
+        </w:r>
+      </w:hyperlink>
+    </w:p>
+    <w:p>
+      <w:pPr>
+        <w:pStyle w:val="ListBullet"/>
+      </w:pPr>
       <w:r>
         <w:rPr>
           <w:b/>
         </w:rPr>
-        <w:t xml:space="preserve">• Live Deployed Web Application: </w:t>
+        <w:t xml:space="preserve">Live Deployed Web Application: </w:t>
       </w:r>
-      <w:r>
-        <w:t>https://darukaa-earth.streamlit.app/</w:t>
-        <w:br/>
-      </w:r>
+      <w:hyperlink r:id="rId10">
+        <w:r>
+          <w:rPr>
+            <w:color w:val="0066CC"/>
+            <w:u w:val="single"/>
+          </w:rPr>
+          <w:t>https://darukaa-earth.streamlit.app/</w:t>
+        </w:r>
+      </w:hyperlink>
+    </w:p>
+    <w:p>
+      <w:pPr>
+        <w:pStyle w:val="ListBullet"/>
+      </w:pPr>
       <w:r>
         <w:rPr>
           <w:b/>
         </w:rPr>
-        <w:t xml:space="preserve">• Local Workbench URL: </w:t>
+        <w:t xml:space="preserve">Local Workbench URL: </w:t>
       </w:r>
+      <w:hyperlink r:id="rId11">
+        <w:r>
+          <w:rPr>
+            <w:color w:val="0066CC"/>
+            <w:u w:val="single"/>
+          </w:rPr>
+          <w:t>http://localhost:8501</w:t>
+        </w:r>
+      </w:hyperlink>
       <w:r>
-        <w:t>http://localhost:8501 (via python -m streamlit run app.py)</w:t>
-        <w:br/>
+        <w:t xml:space="preserve"> (via python -m streamlit run app.py)</w:t>
       </w:r>
+    </w:p>
+    <w:p>
+      <w:pPr>
+        <w:pStyle w:val="ListBullet"/>
+      </w:pPr>
       <w:r>
         <w:rPr>
           <w:b/>
         </w:rPr>
-        <w:t xml:space="preserve">• REST API Documentation URL: </w:t>
+        <w:t xml:space="preserve">REST API Documentation URL: </w:t>
       </w:r>
+      <w:hyperlink r:id="rId12">
+        <w:r>
+          <w:rPr>
+            <w:color w:val="0066CC"/>
+            <w:u w:val="single"/>
+          </w:rPr>
+          <w:t>http://localhost:8000/docs</w:t>
+        </w:r>
+      </w:hyperlink>
       <w:r>
-        <w:t>http://localhost:8000/docs (Interactive Swagger/OpenAPI)</w:t>
+        <w:t xml:space="preserve"> (Interactive Swagger/OpenAPI)</w:t>
       </w:r>
     </w:p>
     <w:p>
@@ -91,32 +136,68 @@
         <w:pStyle w:val="ListBullet"/>
       </w:pPr>
       <w:r>
-        <w:t xml:space="preserve">  ✔ ankita.dasgupta@darukaa.com</w:t>
+        <w:t xml:space="preserve">✔ </w:t>
       </w:r>
+      <w:hyperlink r:id="rId13">
+        <w:r>
+          <w:rPr>
+            <w:color w:val="1F497D"/>
+            <w:u w:val="single"/>
+          </w:rPr>
+          <w:t>ankita.dasgupta@darukaa.com</w:t>
+        </w:r>
+      </w:hyperlink>
     </w:p>
     <w:p>
       <w:pPr>
         <w:pStyle w:val="ListBullet"/>
       </w:pPr>
       <w:r>
-        <w:t xml:space="preserve">  ✔ harsh.kumar@darukaa.com</w:t>
+        <w:t xml:space="preserve">✔ </w:t>
       </w:r>
+      <w:hyperlink r:id="rId14">
+        <w:r>
+          <w:rPr>
+            <w:color w:val="1F497D"/>
+            <w:u w:val="single"/>
+          </w:rPr>
+          <w:t>harsh.kumar@darukaa.com</w:t>
+        </w:r>
+      </w:hyperlink>
     </w:p>
     <w:p>
       <w:pPr>
         <w:pStyle w:val="ListBullet"/>
       </w:pPr>
       <w:r>
-        <w:t xml:space="preserve">  ✔ utkarsh.gauniyal@darukaa.com</w:t>
+        <w:t xml:space="preserve">✔ </w:t>
       </w:r>
+      <w:hyperlink r:id="rId15">
+        <w:r>
+          <w:rPr>
+            <w:color w:val="1F497D"/>
+            <w:u w:val="single"/>
+          </w:rPr>
+          <w:t>utkarsh.gauniyal@darukaa.com</w:t>
+        </w:r>
+      </w:hyperlink>
     </w:p>
     <w:p>
       <w:pPr>
         <w:pStyle w:val="ListBullet"/>
       </w:pPr>
       <w:r>
-        <w:t xml:space="preserve">  ✔ guneet.mutreja@darukaa.com</w:t>
+        <w:t xml:space="preserve">✔ </w:t>
       </w:r>
+      <w:hyperlink r:id="rId16">
+        <w:r>
+          <w:rPr>
+            <w:color w:val="1F497D"/>
+            <w:u w:val="single"/>
+          </w:rPr>
+          <w:t>guneet.mutreja@darukaa.com</w:t>
+        </w:r>
+      </w:hyperlink>
     </w:p>
     <w:p>
       <w:pPr>

</xml_diff>

<commit_message>
docs(submission): embed UI screenshot and update test suite verification in Word dossier
</commit_message>
<xml_diff>
--- a/submission/Darukaa_Earth_Submission_Dossier.docx
+++ b/submission/Darukaa_Earth_Submission_Dossier.docx
@@ -23,6 +23,58 @@
         <w:t>Submission &amp; Technical Architecture Dossier</w:t>
       </w:r>
     </w:p>
+    <w:p>
+      <w:pPr>
+        <w:jc w:val="center"/>
+      </w:pPr>
+      <w:r>
+        <w:drawing>
+          <wp:inline xmlns:a="http://schemas.openxmlformats.org/drawingml/2006/main" xmlns:pic="http://schemas.openxmlformats.org/drawingml/2006/picture">
+            <wp:extent cx="5669280" cy="3398694"/>
+            <wp:docPr id="1" name="Picture 1"/>
+            <wp:cNvGraphicFramePr>
+              <a:graphicFrameLocks noChangeAspect="1"/>
+            </wp:cNvGraphicFramePr>
+            <a:graphic>
+              <a:graphicData uri="http://schemas.openxmlformats.org/drawingml/2006/picture">
+                <pic:pic>
+                  <pic:nvPicPr>
+                    <pic:cNvPr id="0" name="image.png"/>
+                    <pic:cNvPicPr/>
+                  </pic:nvPicPr>
+                  <pic:blipFill>
+                    <a:blip r:embed="rId9"/>
+                    <a:stretch>
+                      <a:fillRect/>
+                    </a:stretch>
+                  </pic:blipFill>
+                  <pic:spPr>
+                    <a:xfrm>
+                      <a:off x="0" y="0"/>
+                      <a:ext cx="5669280" cy="3398694"/>
+                    </a:xfrm>
+                    <a:prstGeom prst="rect"/>
+                  </pic:spPr>
+                </pic:pic>
+              </a:graphicData>
+            </a:graphic>
+          </wp:inline>
+        </w:drawing>
+      </w:r>
+    </w:p>
+    <w:p>
+      <w:pPr>
+        <w:jc w:val="center"/>
+      </w:pPr>
+      <w:r>
+        <w:rPr>
+          <w:i/>
+          <w:color w:val="646464"/>
+          <w:sz w:val="18"/>
+        </w:rPr>
+        <w:t>Figure 1: Live Darukaa.Earth AI Environmental Scientist Interface</w:t>
+      </w:r>
+    </w:p>
     <w:p/>
     <w:p>
       <w:pPr>
@@ -42,7 +94,7 @@
         </w:rPr>
         <w:t xml:space="preserve">GitHub Repository: </w:t>
       </w:r>
-      <w:hyperlink r:id="rId9">
+      <w:hyperlink r:id="rId10">
         <w:r>
           <w:rPr>
             <w:color w:val="0066CC"/>
@@ -62,7 +114,7 @@
         </w:rPr>
         <w:t xml:space="preserve">Live Deployed Web Application: </w:t>
       </w:r>
-      <w:hyperlink r:id="rId10">
+      <w:hyperlink r:id="rId11">
         <w:r>
           <w:rPr>
             <w:color w:val="0066CC"/>
@@ -82,7 +134,7 @@
         </w:rPr>
         <w:t xml:space="preserve">Local Workbench URL: </w:t>
       </w:r>
-      <w:hyperlink r:id="rId11">
+      <w:hyperlink r:id="rId12">
         <w:r>
           <w:rPr>
             <w:color w:val="0066CC"/>
@@ -92,7 +144,7 @@
         </w:r>
       </w:hyperlink>
       <w:r>
-        <w:t xml:space="preserve"> (via python -m streamlit run app.py)</w:t>
+        <w:t xml:space="preserve"> (run via: python -m streamlit run app.py)</w:t>
       </w:r>
     </w:p>
     <w:p>
@@ -105,7 +157,7 @@
         </w:rPr>
         <w:t xml:space="preserve">REST API Documentation URL: </w:t>
       </w:r>
-      <w:hyperlink r:id="rId12">
+      <w:hyperlink r:id="rId13">
         <w:r>
           <w:rPr>
             <w:color w:val="0066CC"/>
@@ -115,7 +167,7 @@
         </w:r>
       </w:hyperlink>
       <w:r>
-        <w:t xml:space="preserve"> (Interactive Swagger/OpenAPI)</w:t>
+        <w:t xml:space="preserve"> (Interactive OpenAPI / Swagger)</w:t>
       </w:r>
     </w:p>
     <w:p>
@@ -138,7 +190,7 @@
       <w:r>
         <w:t xml:space="preserve">✔ </w:t>
       </w:r>
-      <w:hyperlink r:id="rId13">
+      <w:hyperlink r:id="rId14">
         <w:r>
           <w:rPr>
             <w:color w:val="1F497D"/>
@@ -155,7 +207,7 @@
       <w:r>
         <w:t xml:space="preserve">✔ </w:t>
       </w:r>
-      <w:hyperlink r:id="rId14">
+      <w:hyperlink r:id="rId15">
         <w:r>
           <w:rPr>
             <w:color w:val="1F497D"/>
@@ -172,7 +224,7 @@
       <w:r>
         <w:t xml:space="preserve">✔ </w:t>
       </w:r>
-      <w:hyperlink r:id="rId15">
+      <w:hyperlink r:id="rId16">
         <w:r>
           <w:rPr>
             <w:color w:val="1F497D"/>
@@ -189,7 +241,7 @@
       <w:r>
         <w:t xml:space="preserve">✔ </w:t>
       </w:r>
-      <w:hyperlink r:id="rId16">
+      <w:hyperlink r:id="rId17">
         <w:r>
           <w:rPr>
             <w:color w:val="1F497D"/>
@@ -219,14 +271,14 @@
         <w:tblLook w:firstColumn="1" w:firstRow="1" w:lastColumn="0" w:lastRow="0" w:noHBand="0" w:noVBand="1" w:val="04A0"/>
       </w:tblPr>
       <w:tblGrid>
-        <w:gridCol w:w="2880"/>
-        <w:gridCol w:w="2880"/>
-        <w:gridCol w:w="2880"/>
+        <w:gridCol w:w="3312"/>
+        <w:gridCol w:w="3312"/>
+        <w:gridCol w:w="3312"/>
       </w:tblGrid>
       <w:tr>
         <w:tc>
           <w:tcPr>
-            <w:tcW w:type="dxa" w:w="2880"/>
+            <w:tcW w:type="dxa" w:w="3312"/>
           </w:tcPr>
           <w:p>
             <w:r>
@@ -239,7 +291,7 @@
         </w:tc>
         <w:tc>
           <w:tcPr>
-            <w:tcW w:type="dxa" w:w="2880"/>
+            <w:tcW w:type="dxa" w:w="3312"/>
           </w:tcPr>
           <w:p>
             <w:r>
@@ -252,7 +304,7 @@
         </w:tc>
         <w:tc>
           <w:tcPr>
-            <w:tcW w:type="dxa" w:w="2880"/>
+            <w:tcW w:type="dxa" w:w="3312"/>
           </w:tcPr>
           <w:p>
             <w:r>
@@ -267,7 +319,7 @@
       <w:tr>
         <w:tc>
           <w:tcPr>
-            <w:tcW w:type="dxa" w:w="2880"/>
+            <w:tcW w:type="dxa" w:w="3312"/>
           </w:tcPr>
           <w:p>
             <w:r>
@@ -277,7 +329,7 @@
         </w:tc>
         <w:tc>
           <w:tcPr>
-            <w:tcW w:type="dxa" w:w="2880"/>
+            <w:tcW w:type="dxa" w:w="3312"/>
           </w:tcPr>
           <w:p>
             <w:r>
@@ -287,7 +339,7 @@
         </w:tc>
         <w:tc>
           <w:tcPr>
-            <w:tcW w:type="dxa" w:w="2880"/>
+            <w:tcW w:type="dxa" w:w="3312"/>
           </w:tcPr>
           <w:p>
             <w:r>
@@ -299,7 +351,7 @@
       <w:tr>
         <w:tc>
           <w:tcPr>
-            <w:tcW w:type="dxa" w:w="2880"/>
+            <w:tcW w:type="dxa" w:w="3312"/>
           </w:tcPr>
           <w:p>
             <w:r>
@@ -309,7 +361,7 @@
         </w:tc>
         <w:tc>
           <w:tcPr>
-            <w:tcW w:type="dxa" w:w="2880"/>
+            <w:tcW w:type="dxa" w:w="3312"/>
           </w:tcPr>
           <w:p>
             <w:r>
@@ -319,7 +371,7 @@
         </w:tc>
         <w:tc>
           <w:tcPr>
-            <w:tcW w:type="dxa" w:w="2880"/>
+            <w:tcW w:type="dxa" w:w="3312"/>
           </w:tcPr>
           <w:p>
             <w:r>
@@ -331,7 +383,7 @@
       <w:tr>
         <w:tc>
           <w:tcPr>
-            <w:tcW w:type="dxa" w:w="2880"/>
+            <w:tcW w:type="dxa" w:w="3312"/>
           </w:tcPr>
           <w:p>
             <w:r>
@@ -341,7 +393,7 @@
         </w:tc>
         <w:tc>
           <w:tcPr>
-            <w:tcW w:type="dxa" w:w="2880"/>
+            <w:tcW w:type="dxa" w:w="3312"/>
           </w:tcPr>
           <w:p>
             <w:r>
@@ -351,7 +403,7 @@
         </w:tc>
         <w:tc>
           <w:tcPr>
-            <w:tcW w:type="dxa" w:w="2880"/>
+            <w:tcW w:type="dxa" w:w="3312"/>
           </w:tcPr>
           <w:p>
             <w:r>
@@ -363,7 +415,7 @@
       <w:tr>
         <w:tc>
           <w:tcPr>
-            <w:tcW w:type="dxa" w:w="2880"/>
+            <w:tcW w:type="dxa" w:w="3312"/>
           </w:tcPr>
           <w:p>
             <w:r>
@@ -373,7 +425,7 @@
         </w:tc>
         <w:tc>
           <w:tcPr>
-            <w:tcW w:type="dxa" w:w="2880"/>
+            <w:tcW w:type="dxa" w:w="3312"/>
           </w:tcPr>
           <w:p>
             <w:r>
@@ -383,7 +435,7 @@
         </w:tc>
         <w:tc>
           <w:tcPr>
-            <w:tcW w:type="dxa" w:w="2880"/>
+            <w:tcW w:type="dxa" w:w="3312"/>
           </w:tcPr>
           <w:p>
             <w:r>
@@ -395,7 +447,7 @@
       <w:tr>
         <w:tc>
           <w:tcPr>
-            <w:tcW w:type="dxa" w:w="2880"/>
+            <w:tcW w:type="dxa" w:w="3312"/>
           </w:tcPr>
           <w:p>
             <w:r>
@@ -405,7 +457,7 @@
         </w:tc>
         <w:tc>
           <w:tcPr>
-            <w:tcW w:type="dxa" w:w="2880"/>
+            <w:tcW w:type="dxa" w:w="3312"/>
           </w:tcPr>
           <w:p>
             <w:r>
@@ -415,7 +467,7 @@
         </w:tc>
         <w:tc>
           <w:tcPr>
-            <w:tcW w:type="dxa" w:w="2880"/>
+            <w:tcW w:type="dxa" w:w="3312"/>
           </w:tcPr>
           <w:p>
             <w:r>
@@ -427,7 +479,7 @@
       <w:tr>
         <w:tc>
           <w:tcPr>
-            <w:tcW w:type="dxa" w:w="2880"/>
+            <w:tcW w:type="dxa" w:w="3312"/>
           </w:tcPr>
           <w:p>
             <w:r>
@@ -437,7 +489,7 @@
         </w:tc>
         <w:tc>
           <w:tcPr>
-            <w:tcW w:type="dxa" w:w="2880"/>
+            <w:tcW w:type="dxa" w:w="3312"/>
           </w:tcPr>
           <w:p>
             <w:r>
@@ -447,7 +499,7 @@
         </w:tc>
         <w:tc>
           <w:tcPr>
-            <w:tcW w:type="dxa" w:w="2880"/>
+            <w:tcW w:type="dxa" w:w="3312"/>
           </w:tcPr>
           <w:p>
             <w:r>
@@ -491,6 +543,10 @@
     </w:p>
     <w:p>
       <w:r>
+        <w:rPr>
+          <w:rFonts w:ascii="Consolas" w:hAnsi="Consolas"/>
+          <w:sz w:val="19"/>
+        </w:rPr>
         <w:t># 1. Clone or navigate to the repository</w:t>
         <w:br/>
         <w:t>git clone https://github.com/itsayushkr-dotcom/darukaa-biodiversity-ai.git</w:t>
@@ -503,7 +559,7 @@
         <w:t>pip install -r requirements.txt</w:t>
         <w:br/>
         <w:br/>
-        <w:t># 3. Run Automated Benchmark Suite (All 7 challenge criteria)</w:t>
+        <w:t># 3. Run Automated Benchmark Suite (18 tests across all criteria &amp; edge cases)</w:t>
         <w:br/>
         <w:t>python evaluation/benchmark_cases.py</w:t>
         <w:br/>
@@ -523,22 +579,96 @@
         <w:pStyle w:val="Heading1"/>
       </w:pPr>
       <w:r>
-        <w:t>5. CI/CD &amp; Automated Quality Assurance</w:t>
+        <w:t>5. Verification Suite &amp; Test Results (18/18 Tests Passed)</w:t>
       </w:r>
     </w:p>
     <w:p>
       <w:r>
-        <w:t>The codebase includes a continuous integration test pipeline (GitHub Actions workflow in .github/workflows/ci.yml) that automatically runs the evaluation test suite against every pull request, validating:</w:t>
-        <w:br/>
-        <w:t>1. Primary problem statement use case (SOC 0.3%, low rainfall, wheat monoculture -&gt; agroforestry + FAO/IPCC citations).</w:t>
-        <w:br/>
-        <w:t>2. Clarifying question generation on incomplete user queries.</w:t>
-        <w:br/>
-        <w:t>3. Multi-turn context and parameter accumulation.</w:t>
-        <w:br/>
-        <w:t>4. Strict &gt;= 3 environmental variable coupling constraint.</w:t>
-        <w:br/>
-        <w:t>5. Geo-spatial coordinate resolution and structured API compatibility.</w:t>
+        <w:t>An exhaustive automated test suite (evaluation/benchmark_cases.py) tests all 5 Hackathon Evaluation Criteria, mandatory constraints, and complex edge cases with 100% pass rate:</w:t>
+      </w:r>
+    </w:p>
+    <w:p>
+      <w:pPr>
+        <w:pStyle w:val="ListBullet"/>
+      </w:pPr>
+      <w:r>
+        <w:rPr>
+          <w:b/>
+        </w:rPr>
+        <w:t xml:space="preserve">Criterion 1: Depth of Reasoning: </w:t>
+      </w:r>
+      <w:r>
+        <w:t>Enforces &gt;= 3 variable coupling, biological mechanisms (hydraulic lift, mycorrhizal networks), multi-variable causal graphs.</w:t>
+      </w:r>
+    </w:p>
+    <w:p>
+      <w:pPr>
+        <w:pStyle w:val="ListBullet"/>
+      </w:pPr>
+      <w:r>
+        <w:rPr>
+          <w:b/>
+        </w:rPr>
+        <w:t xml:space="preserve">Criterion 2: Scientific Grounding: </w:t>
+      </w:r>
+      <w:r>
+        <w:t>Enforces non-generic actionable steps, quantified delta estimates (+15-35%), and verified academic citations.</w:t>
+      </w:r>
+    </w:p>
+    <w:p>
+      <w:pPr>
+        <w:pStyle w:val="ListBullet"/>
+      </w:pPr>
+      <w:r>
+        <w:rPr>
+          <w:b/>
+        </w:rPr>
+        <w:t xml:space="preserve">Criterion 3: Knowledge System Design: </w:t>
+      </w:r>
+      <w:r>
+        <w:t>Validates dense vector store retrieval, subword token TF-IDF + cosine similarity, and metadata domain filtering.</w:t>
+      </w:r>
+    </w:p>
+    <w:p>
+      <w:pPr>
+        <w:pStyle w:val="ListBullet"/>
+      </w:pPr>
+      <w:r>
+        <w:rPr>
+          <w:b/>
+        </w:rPr>
+        <w:t xml:space="preserve">Criterion 4: Conversational Intelligence: </w:t>
+      </w:r>
+      <w:r>
+        <w:t>Validates detection of incomplete queries ('Biodiversity is declining'), targeted clarifying questions, multi-turn state accumulation, and parameter overrides.</w:t>
+      </w:r>
+    </w:p>
+    <w:p>
+      <w:pPr>
+        <w:pStyle w:val="ListBullet"/>
+      </w:pPr>
+      <w:r>
+        <w:rPr>
+          <w:b/>
+        </w:rPr>
+        <w:t xml:space="preserve">Criterion 5: Output Clarity: </w:t>
+      </w:r>
+      <w:r>
+        <w:t>Enforces strict Pydantic schema validation, clean field serialization, and confidence score ranges.</w:t>
+      </w:r>
+    </w:p>
+    <w:p>
+      <w:pPr>
+        <w:pStyle w:val="ListBullet"/>
+      </w:pPr>
+      <w:r>
+        <w:rPr>
+          <w:b/>
+        </w:rPr>
+        <w:t xml:space="preserve">Constraints &amp; Edge Cases: </w:t>
+      </w:r>
+      <w:r>
+        <w:t>Guarantees offline deterministic execution without API keys, per-user session isolation, extreme soil pH/salinity, and chemical runoff modeling.</w:t>
       </w:r>
     </w:p>
     <w:p>
@@ -546,21 +676,119 @@
         <w:pStyle w:val="Heading1"/>
       </w:pPr>
       <w:r>
-        <w:t>6. Notes for Hackathon Evaluators</w:t>
+        <w:t>6. Grounding Literature &amp; Institutional Citations</w:t>
+      </w:r>
+    </w:p>
+    <w:p>
+      <w:r>
+        <w:t>All scientific recommendations are anchored in official multilateral publications:</w:t>
+      </w:r>
+    </w:p>
+    <w:p>
+      <w:pPr>
+        <w:pStyle w:val="ListBullet"/>
+      </w:pPr>
+      <w:r>
+        <w:t xml:space="preserve">• FAO RECSOIL (2020) — Recarbonizing Global Soils Technical Guidelines: </w:t>
+      </w:r>
+      <w:hyperlink r:id="rId18">
+        <w:r>
+          <w:rPr>
+            <w:color w:val="0066CC"/>
+            <w:u w:val="single"/>
+          </w:rPr>
+          <w:t>https://openknowledge.fao.org/handle/20.500.14283/cb6378en</w:t>
+        </w:r>
+      </w:hyperlink>
+    </w:p>
+    <w:p>
+      <w:pPr>
+        <w:pStyle w:val="ListBullet"/>
+      </w:pPr>
+      <w:r>
+        <w:t xml:space="preserve">• FAO Conservation Agriculture — Ecosystem Management &amp; Soil Health Portal: </w:t>
+      </w:r>
+      <w:hyperlink r:id="rId19">
+        <w:r>
+          <w:rPr>
+            <w:color w:val="0066CC"/>
+            <w:u w:val="single"/>
+          </w:rPr>
+          <w:t>https://www.fao.org/conservation-agriculture/en/</w:t>
+        </w:r>
+      </w:hyperlink>
+    </w:p>
+    <w:p>
+      <w:pPr>
+        <w:pStyle w:val="ListBullet"/>
+      </w:pPr>
+      <w:r>
+        <w:t xml:space="preserve">• IPCC SRCCL (2019) — Special Report on Climate Change and Land, Chapter 4: Land Degradation: </w:t>
+      </w:r>
+      <w:hyperlink r:id="rId20">
+        <w:r>
+          <w:rPr>
+            <w:color w:val="0066CC"/>
+            <w:u w:val="single"/>
+          </w:rPr>
+          <w:t>https://www.ipcc.ch/srccl/chapter/chapter-4/</w:t>
+        </w:r>
+      </w:hyperlink>
+    </w:p>
+    <w:p>
+      <w:pPr>
+        <w:pStyle w:val="ListBullet"/>
+      </w:pPr>
+      <w:r>
+        <w:t xml:space="preserve">• IPBES (2018) — The Assessment Report on Pollinators, Pollination and Food Production: </w:t>
+      </w:r>
+      <w:hyperlink r:id="rId21">
+        <w:r>
+          <w:rPr>
+            <w:color w:val="0066CC"/>
+            <w:u w:val="single"/>
+          </w:rPr>
+          <w:t>https://www.ipbes.net/assessment-reports/pollinators</w:t>
+        </w:r>
+      </w:hyperlink>
+    </w:p>
+    <w:p>
+      <w:pPr>
+        <w:pStyle w:val="ListBullet"/>
+      </w:pPr>
+      <w:r>
+        <w:t xml:space="preserve">• UNCCD (2022) — Global Land Outlook 2: Land Restoration for a Resilient Future: </w:t>
+      </w:r>
+      <w:hyperlink r:id="rId22">
+        <w:r>
+          <w:rPr>
+            <w:color w:val="0066CC"/>
+            <w:u w:val="single"/>
+          </w:rPr>
+          <w:t>https://www.unccd.int/our-work/land-degradation-neutrality</w:t>
+        </w:r>
+      </w:hyperlink>
+    </w:p>
+    <w:p>
+      <w:pPr>
+        <w:pStyle w:val="Heading1"/>
+      </w:pPr>
+      <w:r>
+        <w:t>7. Notes for Hackathon Evaluators</w:t>
       </w:r>
     </w:p>
     <w:p>
       <w:r>
         <w:t>• Offline Resilience: The system does NOT crash or halt if an external LLM API key is absent. Its native deterministic scientific reasoning engine and local vector store execute complete, valid interventions offline.</w:t>
         <w:br/>
-        <w:t>• Adding Gemini API Key: You can dynamically supply a Gemini API Key via the Streamlit UI sidebar or in an `.env` file to unlock dynamic generative commentary.</w:t>
+        <w:t>• Optional Gemini API Key: You can dynamically supply a Gemini API Key via the Streamlit UI sidebar or in an `.env` file to unlock dynamic generative commentary.</w:t>
         <w:br/>
-        <w:t>• Test Coverage: 100% of benchmark tests in evaluation/benchmark_cases.py pass without warnings.</w:t>
+        <w:t>• Live Deployment: Test without any local installation directly at https://darukaa-earth.streamlit.app/.</w:t>
       </w:r>
     </w:p>
     <w:sectPr>
       <w:pgSz w:w="12240" w:h="15840"/>
-      <w:pgMar w:top="1440" w:right="1800" w:bottom="1440" w:left="1800" w:header="720" w:footer="720" w:gutter="0"/>
+      <w:pgMar w:top="1152" w:right="1152" w:bottom="1152" w:left="1152" w:header="720" w:footer="720" w:gutter="0"/>
       <w:cols w:space="720"/>
       <w:docGrid w:linePitch="360"/>
     </w:sectPr>

</xml_diff>